<commit_message>
updated the print of the dc formula to include alll the 10 trials
</commit_message>
<xml_diff>
--- a/core/main/templates/print_excel/dc_formula_template.docx
+++ b/core/main/templates/print_excel/dc_formula_template.docx
@@ -42,7 +42,7 @@
             <v:path o:extrusionok="f" gradientshapeok="t" o:connecttype="rect"/>
             <o:lock v:ext="edit" aspectratio="t"/>
           </v:shapetype>
-          <v:shape id="_x0000_s1055" type="#_x0000_t75" style="position:absolute;left:0;text-align:left;margin-left:-47pt;margin-top:-53.1pt;width:276.65pt;height:46pt;z-index:-4">
+          <v:shape id="_x0000_s1055" type="#_x0000_t75" style="position:absolute;left:0;text-align:left;margin-left:-47pt;margin-top:-53.1pt;width:276.65pt;height:46pt;z-index:-1">
             <v:imagedata r:id="rId7" o:title="mbpi_only"/>
           </v:shape>
         </w:pict>
@@ -717,12 +717,6 @@
         <w:gridCol w:w="1260"/>
       </w:tblGrid>
       <w:tr>
-        <w:tblPrEx>
-          <w:tblCellMar>
-            <w:top w:w="0" w:type="dxa"/>
-            <w:bottom w:w="0" w:type="dxa"/>
-          </w:tblCellMar>
-        </w:tblPrEx>
         <w:trPr>
           <w:trHeight w:val="498"/>
         </w:trPr>
@@ -1310,12 +1304,6 @@
         </w:tc>
       </w:tr>
       <w:tr>
-        <w:tblPrEx>
-          <w:tblCellMar>
-            <w:top w:w="0" w:type="dxa"/>
-            <w:bottom w:w="0" w:type="dxa"/>
-          </w:tblCellMar>
-        </w:tblPrEx>
         <w:trPr>
           <w:trHeight w:val="498"/>
         </w:trPr>
@@ -1607,12 +1595,6 @@
         </w:tc>
       </w:tr>
       <w:tr>
-        <w:tblPrEx>
-          <w:tblCellMar>
-            <w:top w:w="0" w:type="dxa"/>
-            <w:bottom w:w="0" w:type="dxa"/>
-          </w:tblCellMar>
-        </w:tblPrEx>
         <w:trPr>
           <w:trHeight w:val="498"/>
         </w:trPr>
@@ -1904,12 +1886,6 @@
         </w:tc>
       </w:tr>
       <w:tr>
-        <w:tblPrEx>
-          <w:tblCellMar>
-            <w:top w:w="0" w:type="dxa"/>
-            <w:bottom w:w="0" w:type="dxa"/>
-          </w:tblCellMar>
-        </w:tblPrEx>
         <w:trPr>
           <w:trHeight w:val="498"/>
         </w:trPr>
@@ -2201,12 +2177,6 @@
         </w:tc>
       </w:tr>
       <w:tr>
-        <w:tblPrEx>
-          <w:tblCellMar>
-            <w:top w:w="0" w:type="dxa"/>
-            <w:bottom w:w="0" w:type="dxa"/>
-          </w:tblCellMar>
-        </w:tblPrEx>
         <w:trPr>
           <w:trHeight w:val="498"/>
         </w:trPr>
@@ -2498,12 +2468,6 @@
         </w:tc>
       </w:tr>
       <w:tr>
-        <w:tblPrEx>
-          <w:tblCellMar>
-            <w:top w:w="0" w:type="dxa"/>
-            <w:bottom w:w="0" w:type="dxa"/>
-          </w:tblCellMar>
-        </w:tblPrEx>
         <w:trPr>
           <w:trHeight w:val="478"/>
         </w:trPr>
@@ -2795,12 +2759,6 @@
         </w:tc>
       </w:tr>
       <w:tr>
-        <w:tblPrEx>
-          <w:tblCellMar>
-            <w:top w:w="0" w:type="dxa"/>
-            <w:bottom w:w="0" w:type="dxa"/>
-          </w:tblCellMar>
-        </w:tblPrEx>
         <w:trPr>
           <w:trHeight w:val="498"/>
         </w:trPr>
@@ -3092,12 +3050,6 @@
         </w:tc>
       </w:tr>
       <w:tr>
-        <w:tblPrEx>
-          <w:tblCellMar>
-            <w:top w:w="0" w:type="dxa"/>
-            <w:bottom w:w="0" w:type="dxa"/>
-          </w:tblCellMar>
-        </w:tblPrEx>
         <w:trPr>
           <w:trHeight w:val="498"/>
         </w:trPr>
@@ -3389,12 +3341,6 @@
         </w:tc>
       </w:tr>
       <w:tr>
-        <w:tblPrEx>
-          <w:tblCellMar>
-            <w:top w:w="0" w:type="dxa"/>
-            <w:bottom w:w="0" w:type="dxa"/>
-          </w:tblCellMar>
-        </w:tblPrEx>
         <w:trPr>
           <w:trHeight w:val="498"/>
         </w:trPr>
@@ -3686,12 +3632,6 @@
         </w:tc>
       </w:tr>
       <w:tr>
-        <w:tblPrEx>
-          <w:tblCellMar>
-            <w:top w:w="0" w:type="dxa"/>
-            <w:bottom w:w="0" w:type="dxa"/>
-          </w:tblCellMar>
-        </w:tblPrEx>
         <w:trPr>
           <w:trHeight w:val="498"/>
         </w:trPr>
@@ -3983,12 +3923,6 @@
         </w:tc>
       </w:tr>
       <w:tr>
-        <w:tblPrEx>
-          <w:tblCellMar>
-            <w:top w:w="0" w:type="dxa"/>
-            <w:bottom w:w="0" w:type="dxa"/>
-          </w:tblCellMar>
-        </w:tblPrEx>
         <w:trPr>
           <w:trHeight w:val="498"/>
         </w:trPr>
@@ -3998,7 +3932,7 @@
             <w:tcBorders>
               <w:top w:val="single" w:sz="6" w:space="0" w:color="auto"/>
               <w:left w:val="single" w:sz="6" w:space="0" w:color="auto"/>
-              <w:bottom w:val="single" w:sz="6" w:space="0" w:color="auto"/>
+              <w:bottom w:val="single" w:sz="4" w:space="0" w:color="auto"/>
               <w:right w:val="single" w:sz="6" w:space="0" w:color="auto"/>
             </w:tcBorders>
           </w:tcPr>
@@ -4024,7 +3958,7 @@
             <w:tcBorders>
               <w:top w:val="single" w:sz="6" w:space="0" w:color="auto"/>
               <w:left w:val="single" w:sz="6" w:space="0" w:color="auto"/>
-              <w:bottom w:val="single" w:sz="6" w:space="0" w:color="auto"/>
+              <w:bottom w:val="single" w:sz="4" w:space="0" w:color="auto"/>
               <w:right w:val="single" w:sz="6" w:space="0" w:color="auto"/>
             </w:tcBorders>
           </w:tcPr>
@@ -4050,7 +3984,7 @@
             <w:tcBorders>
               <w:top w:val="single" w:sz="6" w:space="0" w:color="auto"/>
               <w:left w:val="single" w:sz="6" w:space="0" w:color="auto"/>
-              <w:bottom w:val="single" w:sz="6" w:space="0" w:color="auto"/>
+              <w:bottom w:val="single" w:sz="4" w:space="0" w:color="auto"/>
               <w:right w:val="single" w:sz="6" w:space="0" w:color="auto"/>
             </w:tcBorders>
           </w:tcPr>
@@ -4076,7 +4010,7 @@
             <w:tcBorders>
               <w:top w:val="single" w:sz="6" w:space="0" w:color="auto"/>
               <w:left w:val="single" w:sz="6" w:space="0" w:color="auto"/>
-              <w:bottom w:val="single" w:sz="6" w:space="0" w:color="auto"/>
+              <w:bottom w:val="single" w:sz="4" w:space="0" w:color="auto"/>
               <w:right w:val="single" w:sz="6" w:space="0" w:color="auto"/>
             </w:tcBorders>
           </w:tcPr>
@@ -4102,7 +4036,7 @@
             <w:tcBorders>
               <w:top w:val="single" w:sz="6" w:space="0" w:color="auto"/>
               <w:left w:val="single" w:sz="6" w:space="0" w:color="auto"/>
-              <w:bottom w:val="single" w:sz="6" w:space="0" w:color="auto"/>
+              <w:bottom w:val="single" w:sz="4" w:space="0" w:color="auto"/>
               <w:right w:val="single" w:sz="6" w:space="0" w:color="auto"/>
             </w:tcBorders>
           </w:tcPr>
@@ -4128,7 +4062,7 @@
             <w:tcBorders>
               <w:top w:val="single" w:sz="6" w:space="0" w:color="auto"/>
               <w:left w:val="single" w:sz="6" w:space="0" w:color="auto"/>
-              <w:bottom w:val="single" w:sz="6" w:space="0" w:color="auto"/>
+              <w:bottom w:val="single" w:sz="4" w:space="0" w:color="auto"/>
               <w:right w:val="single" w:sz="6" w:space="0" w:color="auto"/>
             </w:tcBorders>
           </w:tcPr>
@@ -4154,7 +4088,7 @@
             <w:tcBorders>
               <w:top w:val="single" w:sz="6" w:space="0" w:color="auto"/>
               <w:left w:val="single" w:sz="6" w:space="0" w:color="auto"/>
-              <w:bottom w:val="single" w:sz="6" w:space="0" w:color="auto"/>
+              <w:bottom w:val="single" w:sz="4" w:space="0" w:color="auto"/>
               <w:right w:val="single" w:sz="6" w:space="0" w:color="auto"/>
             </w:tcBorders>
           </w:tcPr>
@@ -4180,7 +4114,7 @@
             <w:tcBorders>
               <w:top w:val="single" w:sz="6" w:space="0" w:color="auto"/>
               <w:left w:val="single" w:sz="6" w:space="0" w:color="auto"/>
-              <w:bottom w:val="single" w:sz="6" w:space="0" w:color="auto"/>
+              <w:bottom w:val="single" w:sz="4" w:space="0" w:color="auto"/>
               <w:right w:val="single" w:sz="6" w:space="0" w:color="auto"/>
             </w:tcBorders>
           </w:tcPr>
@@ -4206,7 +4140,7 @@
             <w:tcBorders>
               <w:top w:val="single" w:sz="6" w:space="0" w:color="auto"/>
               <w:left w:val="single" w:sz="6" w:space="0" w:color="auto"/>
-              <w:bottom w:val="single" w:sz="6" w:space="0" w:color="auto"/>
+              <w:bottom w:val="single" w:sz="4" w:space="0" w:color="auto"/>
               <w:right w:val="single" w:sz="6" w:space="0" w:color="auto"/>
             </w:tcBorders>
           </w:tcPr>
@@ -4232,7 +4166,7 @@
             <w:tcBorders>
               <w:top w:val="single" w:sz="6" w:space="0" w:color="auto"/>
               <w:left w:val="single" w:sz="6" w:space="0" w:color="auto"/>
-              <w:bottom w:val="single" w:sz="6" w:space="0" w:color="auto"/>
+              <w:bottom w:val="single" w:sz="4" w:space="0" w:color="auto"/>
               <w:right w:val="single" w:sz="6" w:space="0" w:color="auto"/>
             </w:tcBorders>
           </w:tcPr>
@@ -4258,8 +4192,266 @@
             <w:tcBorders>
               <w:top w:val="single" w:sz="6" w:space="0" w:color="auto"/>
               <w:left w:val="single" w:sz="6" w:space="0" w:color="auto"/>
-              <w:bottom w:val="single" w:sz="6" w:space="0" w:color="auto"/>
-              <w:right w:val="single" w:sz="6" w:space="0" w:color="auto"/>
+              <w:bottom w:val="single" w:sz="4" w:space="0" w:color="auto"/>
+              <w:right w:val="single" w:sz="6" w:space="0" w:color="auto"/>
+            </w:tcBorders>
+          </w:tcPr>
+          <w:p>
+            <w:pPr>
+              <w:autoSpaceDE w:val="0"/>
+              <w:autoSpaceDN w:val="0"/>
+              <w:adjustRightInd w:val="0"/>
+              <w:spacing w:after="0" w:line="240" w:lineRule="auto"/>
+              <w:rPr>
+                <w:rFonts w:ascii="Times New Roman" w:hAnsi="Times New Roman"/>
+                <w:b/>
+                <w:bCs/>
+                <w:sz w:val="24"/>
+                <w:szCs w:val="24"/>
+              </w:rPr>
+            </w:pPr>
+          </w:p>
+        </w:tc>
+      </w:tr>
+      <w:tr>
+        <w:trPr>
+          <w:trHeight w:val="130"/>
+        </w:trPr>
+        <w:tc>
+          <w:tcPr>
+            <w:tcW w:w="1537" w:type="dxa"/>
+            <w:tcBorders>
+              <w:top w:val="single" w:sz="4" w:space="0" w:color="auto"/>
+            </w:tcBorders>
+          </w:tcPr>
+          <w:p>
+            <w:pPr>
+              <w:autoSpaceDE w:val="0"/>
+              <w:autoSpaceDN w:val="0"/>
+              <w:adjustRightInd w:val="0"/>
+              <w:spacing w:after="0" w:line="240" w:lineRule="auto"/>
+              <w:rPr>
+                <w:rFonts w:ascii="Times New Roman" w:hAnsi="Times New Roman"/>
+                <w:b/>
+                <w:bCs/>
+                <w:sz w:val="24"/>
+                <w:szCs w:val="24"/>
+              </w:rPr>
+            </w:pPr>
+          </w:p>
+        </w:tc>
+        <w:tc>
+          <w:tcPr>
+            <w:tcW w:w="1339" w:type="dxa"/>
+            <w:tcBorders>
+              <w:top w:val="single" w:sz="4" w:space="0" w:color="auto"/>
+            </w:tcBorders>
+          </w:tcPr>
+          <w:p>
+            <w:pPr>
+              <w:autoSpaceDE w:val="0"/>
+              <w:autoSpaceDN w:val="0"/>
+              <w:adjustRightInd w:val="0"/>
+              <w:spacing w:after="0" w:line="240" w:lineRule="auto"/>
+              <w:rPr>
+                <w:rFonts w:ascii="Times New Roman" w:hAnsi="Times New Roman"/>
+                <w:b/>
+                <w:bCs/>
+                <w:sz w:val="24"/>
+                <w:szCs w:val="24"/>
+              </w:rPr>
+            </w:pPr>
+          </w:p>
+        </w:tc>
+        <w:tc>
+          <w:tcPr>
+            <w:tcW w:w="1339" w:type="dxa"/>
+            <w:tcBorders>
+              <w:top w:val="single" w:sz="4" w:space="0" w:color="auto"/>
+            </w:tcBorders>
+          </w:tcPr>
+          <w:p>
+            <w:pPr>
+              <w:autoSpaceDE w:val="0"/>
+              <w:autoSpaceDN w:val="0"/>
+              <w:adjustRightInd w:val="0"/>
+              <w:spacing w:after="0" w:line="240" w:lineRule="auto"/>
+              <w:rPr>
+                <w:rFonts w:ascii="Times New Roman" w:hAnsi="Times New Roman"/>
+                <w:b/>
+                <w:bCs/>
+                <w:sz w:val="24"/>
+                <w:szCs w:val="24"/>
+              </w:rPr>
+            </w:pPr>
+          </w:p>
+        </w:tc>
+        <w:tc>
+          <w:tcPr>
+            <w:tcW w:w="1340" w:type="dxa"/>
+            <w:tcBorders>
+              <w:top w:val="single" w:sz="4" w:space="0" w:color="auto"/>
+            </w:tcBorders>
+          </w:tcPr>
+          <w:p>
+            <w:pPr>
+              <w:autoSpaceDE w:val="0"/>
+              <w:autoSpaceDN w:val="0"/>
+              <w:adjustRightInd w:val="0"/>
+              <w:spacing w:after="0" w:line="240" w:lineRule="auto"/>
+              <w:rPr>
+                <w:rFonts w:ascii="Times New Roman" w:hAnsi="Times New Roman"/>
+                <w:b/>
+                <w:bCs/>
+                <w:sz w:val="24"/>
+                <w:szCs w:val="24"/>
+              </w:rPr>
+            </w:pPr>
+          </w:p>
+        </w:tc>
+        <w:tc>
+          <w:tcPr>
+            <w:tcW w:w="1340" w:type="dxa"/>
+            <w:tcBorders>
+              <w:top w:val="single" w:sz="4" w:space="0" w:color="auto"/>
+            </w:tcBorders>
+          </w:tcPr>
+          <w:p>
+            <w:pPr>
+              <w:autoSpaceDE w:val="0"/>
+              <w:autoSpaceDN w:val="0"/>
+              <w:adjustRightInd w:val="0"/>
+              <w:spacing w:after="0" w:line="240" w:lineRule="auto"/>
+              <w:rPr>
+                <w:rFonts w:ascii="Times New Roman" w:hAnsi="Times New Roman"/>
+                <w:b/>
+                <w:bCs/>
+                <w:sz w:val="24"/>
+                <w:szCs w:val="24"/>
+              </w:rPr>
+            </w:pPr>
+          </w:p>
+        </w:tc>
+        <w:tc>
+          <w:tcPr>
+            <w:tcW w:w="1340" w:type="dxa"/>
+            <w:tcBorders>
+              <w:top w:val="single" w:sz="4" w:space="0" w:color="auto"/>
+            </w:tcBorders>
+          </w:tcPr>
+          <w:p>
+            <w:pPr>
+              <w:autoSpaceDE w:val="0"/>
+              <w:autoSpaceDN w:val="0"/>
+              <w:adjustRightInd w:val="0"/>
+              <w:spacing w:after="0" w:line="240" w:lineRule="auto"/>
+              <w:rPr>
+                <w:rFonts w:ascii="Times New Roman" w:hAnsi="Times New Roman"/>
+                <w:b/>
+                <w:bCs/>
+                <w:sz w:val="24"/>
+                <w:szCs w:val="24"/>
+              </w:rPr>
+            </w:pPr>
+          </w:p>
+        </w:tc>
+        <w:tc>
+          <w:tcPr>
+            <w:tcW w:w="1340" w:type="dxa"/>
+            <w:tcBorders>
+              <w:top w:val="single" w:sz="4" w:space="0" w:color="auto"/>
+            </w:tcBorders>
+          </w:tcPr>
+          <w:p>
+            <w:pPr>
+              <w:autoSpaceDE w:val="0"/>
+              <w:autoSpaceDN w:val="0"/>
+              <w:adjustRightInd w:val="0"/>
+              <w:spacing w:after="0" w:line="240" w:lineRule="auto"/>
+              <w:rPr>
+                <w:rFonts w:ascii="Times New Roman" w:hAnsi="Times New Roman"/>
+                <w:b/>
+                <w:bCs/>
+                <w:sz w:val="24"/>
+                <w:szCs w:val="24"/>
+              </w:rPr>
+            </w:pPr>
+          </w:p>
+        </w:tc>
+        <w:tc>
+          <w:tcPr>
+            <w:tcW w:w="1251" w:type="dxa"/>
+            <w:tcBorders>
+              <w:top w:val="single" w:sz="4" w:space="0" w:color="auto"/>
+            </w:tcBorders>
+          </w:tcPr>
+          <w:p>
+            <w:pPr>
+              <w:autoSpaceDE w:val="0"/>
+              <w:autoSpaceDN w:val="0"/>
+              <w:adjustRightInd w:val="0"/>
+              <w:spacing w:after="0" w:line="240" w:lineRule="auto"/>
+              <w:rPr>
+                <w:rFonts w:ascii="Times New Roman" w:hAnsi="Times New Roman"/>
+                <w:b/>
+                <w:bCs/>
+                <w:sz w:val="24"/>
+                <w:szCs w:val="24"/>
+              </w:rPr>
+            </w:pPr>
+          </w:p>
+        </w:tc>
+        <w:tc>
+          <w:tcPr>
+            <w:tcW w:w="1251" w:type="dxa"/>
+            <w:tcBorders>
+              <w:top w:val="single" w:sz="4" w:space="0" w:color="auto"/>
+            </w:tcBorders>
+          </w:tcPr>
+          <w:p>
+            <w:pPr>
+              <w:autoSpaceDE w:val="0"/>
+              <w:autoSpaceDN w:val="0"/>
+              <w:adjustRightInd w:val="0"/>
+              <w:spacing w:after="0" w:line="240" w:lineRule="auto"/>
+              <w:rPr>
+                <w:rFonts w:ascii="Times New Roman" w:hAnsi="Times New Roman"/>
+                <w:b/>
+                <w:bCs/>
+                <w:sz w:val="24"/>
+                <w:szCs w:val="24"/>
+              </w:rPr>
+            </w:pPr>
+          </w:p>
+        </w:tc>
+        <w:tc>
+          <w:tcPr>
+            <w:tcW w:w="1261" w:type="dxa"/>
+            <w:tcBorders>
+              <w:top w:val="single" w:sz="4" w:space="0" w:color="auto"/>
+            </w:tcBorders>
+          </w:tcPr>
+          <w:p>
+            <w:pPr>
+              <w:autoSpaceDE w:val="0"/>
+              <w:autoSpaceDN w:val="0"/>
+              <w:adjustRightInd w:val="0"/>
+              <w:spacing w:after="0" w:line="240" w:lineRule="auto"/>
+              <w:rPr>
+                <w:rFonts w:ascii="Times New Roman" w:hAnsi="Times New Roman"/>
+                <w:b/>
+                <w:bCs/>
+                <w:sz w:val="24"/>
+                <w:szCs w:val="24"/>
+              </w:rPr>
+            </w:pPr>
+          </w:p>
+        </w:tc>
+        <w:tc>
+          <w:tcPr>
+            <w:tcW w:w="1260" w:type="dxa"/>
+            <w:tcBorders>
+              <w:top w:val="single" w:sz="4" w:space="0" w:color="auto"/>
             </w:tcBorders>
           </w:tcPr>
           <w:p>
@@ -4280,49 +4472,6 @@
         </w:tc>
       </w:tr>
     </w:tbl>
-    <w:p>
-      <w:pPr>
-        <w:spacing w:after="0" w:line="240" w:lineRule="auto"/>
-        <w:ind w:left="-720"/>
-        <w:rPr>
-          <w:rFonts w:ascii="Times New Roman" w:hAnsi="Times New Roman"/>
-          <w:b/>
-          <w:bCs/>
-          <w:sz w:val="24"/>
-          <w:szCs w:val="24"/>
-        </w:rPr>
-      </w:pPr>
-      <w:r>
-        <w:rPr>
-          <w:rFonts w:ascii="Times New Roman" w:hAnsi="Times New Roman"/>
-          <w:b/>
-          <w:bCs/>
-          <w:sz w:val="24"/>
-          <w:szCs w:val="24"/>
-        </w:rPr>
-        <w:t xml:space="preserve">                                                                                                                                                                                                                   FM00001</w:t>
-      </w:r>
-      <w:r>
-        <w:rPr>
-          <w:rFonts w:ascii="Times New Roman" w:hAnsi="Times New Roman"/>
-          <w:b/>
-          <w:bCs/>
-          <w:sz w:val="24"/>
-          <w:szCs w:val="24"/>
-        </w:rPr>
-        <w:t>D</w:t>
-      </w:r>
-      <w:r>
-        <w:rPr>
-          <w:rFonts w:ascii="Times New Roman" w:hAnsi="Times New Roman"/>
-          <w:b/>
-          <w:bCs/>
-          <w:sz w:val="24"/>
-          <w:szCs w:val="24"/>
-        </w:rPr>
-        <w:t xml:space="preserve">   </w:t>
-      </w:r>
-    </w:p>
     <w:p>
       <w:pPr>
         <w:spacing w:after="0" w:line="240" w:lineRule="auto"/>
@@ -4353,6 +4502,13 @@
           <w:sz w:val="24"/>
           <w:szCs w:val="24"/>
         </w:rPr>
+        <w:sectPr>
+          <w:type w:val="continuous"/>
+          <w:pgSz w:w="15840" w:h="12240" w:orient="landscape"/>
+          <w:pgMar w:top="1440" w:right="1260" w:bottom="360" w:left="1440" w:header="720" w:footer="720" w:gutter="0"/>
+          <w:cols w:space="720"/>
+          <w:docGrid w:linePitch="360"/>
+        </w:sectPr>
       </w:pPr>
       <w:r>
         <w:rPr>
@@ -4362,10 +4518,27 @@
           <w:sz w:val="24"/>
           <w:szCs w:val="24"/>
         </w:rPr>
-        <w:t xml:space="preserve">                          </w:t>
+        <w:t xml:space="preserve">                                                                                                                                                                                                                   FM00001</w:t>
       </w:r>
-      <w:bookmarkStart w:id="11" w:name="total_value"/>
-      <w:bookmarkEnd w:id="11"/>
+    </w:p>
+    <w:p>
+      <w:pPr>
+        <w:spacing w:after="0" w:line="240" w:lineRule="auto"/>
+        <w:rPr>
+          <w:rFonts w:ascii="Times New Roman" w:hAnsi="Times New Roman"/>
+          <w:b/>
+          <w:bCs/>
+          <w:sz w:val="24"/>
+          <w:szCs w:val="24"/>
+        </w:rPr>
+        <w:sectPr>
+          <w:type w:val="continuous"/>
+          <w:pgSz w:w="15840" w:h="12240" w:orient="landscape"/>
+          <w:pgMar w:top="1440" w:right="1260" w:bottom="360" w:left="1440" w:header="720" w:footer="720" w:gutter="0"/>
+          <w:cols w:space="0"/>
+          <w:docGrid w:linePitch="360"/>
+        </w:sectPr>
+      </w:pPr>
     </w:p>
     <w:p>
       <w:pPr>
@@ -4389,18 +4562,6 @@
           <w:docGrid w:linePitch="360"/>
         </w:sectPr>
       </w:pPr>
-      <w:r>
-        <w:rPr>
-          <w:rFonts w:ascii="Times New Roman" w:hAnsi="Times New Roman"/>
-          <w:b/>
-          <w:bCs/>
-          <w:sz w:val="24"/>
-          <w:szCs w:val="24"/>
-        </w:rPr>
-        <w:t xml:space="preserve">            </w:t>
-      </w:r>
-      <w:bookmarkStart w:id="12" w:name="total_weight"/>
-      <w:bookmarkEnd w:id="12"/>
     </w:p>
     <w:p>
       <w:pPr>
@@ -4445,8 +4606,8 @@
         </w:rPr>
         <w:t xml:space="preserve"> </w:t>
       </w:r>
-      <w:bookmarkStart w:id="13" w:name="note"/>
-      <w:bookmarkEnd w:id="13"/>
+      <w:bookmarkStart w:id="11" w:name="note"/>
+      <w:bookmarkEnd w:id="11"/>
     </w:p>
     <w:p>
       <w:pPr>
@@ -4502,7 +4663,7 @@
           <w:szCs w:val="20"/>
         </w:rPr>
         <w:pict w14:anchorId="4A456FFB">
-          <v:shape id="_x0000_s1056" type="#_x0000_t32" style="position:absolute;left:0;text-align:left;margin-left:25.05pt;margin-top:12.6pt;width:76.35pt;height:0;z-index:13" o:connectortype="straight"/>
+          <v:shape id="_x0000_s1056" type="#_x0000_t32" style="position:absolute;left:0;text-align:left;margin-left:25.05pt;margin-top:12.6pt;width:76.35pt;height:0;z-index:12" o:connectortype="straight"/>
         </w:pict>
       </w:r>
       <w:r>
@@ -4521,8 +4682,8 @@
         </w:rPr>
         <w:t xml:space="preserve"> </w:t>
       </w:r>
-      <w:bookmarkStart w:id="14" w:name="matched_by"/>
-      <w:bookmarkEnd w:id="14"/>
+      <w:bookmarkStart w:id="12" w:name="matched_by"/>
+      <w:bookmarkEnd w:id="12"/>
     </w:p>
     <w:p>
       <w:pPr>
@@ -4546,7 +4707,7 @@
           <w:szCs w:val="20"/>
         </w:rPr>
         <w:pict w14:anchorId="64E5C959">
-          <v:shape id="_x0000_s1057" type="#_x0000_t32" style="position:absolute;left:0;text-align:left;margin-left:25.35pt;margin-top:12.3pt;width:73.75pt;height:0;z-index:14" o:connectortype="straight"/>
+          <v:shape id="_x0000_s1057" type="#_x0000_t32" style="position:absolute;left:0;text-align:left;margin-left:25.35pt;margin-top:12.3pt;width:73.75pt;height:0;z-index:13" o:connectortype="straight"/>
         </w:pict>
       </w:r>
       <w:r>
@@ -4575,8 +4736,8 @@
         </w:rPr>
         <w:t xml:space="preserve"> </w:t>
       </w:r>
-      <w:bookmarkStart w:id="15" w:name="weighed_by"/>
-      <w:bookmarkEnd w:id="15"/>
+      <w:bookmarkStart w:id="13" w:name="weighed_by"/>
+      <w:bookmarkEnd w:id="13"/>
     </w:p>
     <w:p>
       <w:pPr>
@@ -4598,7 +4759,7 @@
           <w:szCs w:val="20"/>
         </w:rPr>
         <w:pict w14:anchorId="5E6A3B04">
-          <v:shape id="_x0000_s1058" type="#_x0000_t32" style="position:absolute;left:0;text-align:left;margin-left:49.8pt;margin-top:12.25pt;width:76.35pt;height:0;z-index:15" o:connectortype="straight"/>
+          <v:shape id="_x0000_s1058" type="#_x0000_t32" style="position:absolute;left:0;text-align:left;margin-left:49.8pt;margin-top:12.25pt;width:76.35pt;height:0;z-index:14" o:connectortype="straight"/>
         </w:pict>
       </w:r>
       <w:r>
@@ -4641,8 +4802,8 @@
         </w:rPr>
         <w:t xml:space="preserve"> </w:t>
       </w:r>
-      <w:bookmarkStart w:id="16" w:name="encoded_by"/>
-      <w:bookmarkEnd w:id="16"/>
+      <w:bookmarkStart w:id="14" w:name="encoded_by"/>
+      <w:bookmarkEnd w:id="14"/>
     </w:p>
     <w:sectPr>
       <w:type w:val="continuous"/>
@@ -5113,6 +5274,7 @@
   <w:style w:type="character" w:default="1" w:styleId="DefaultParagraphFont">
     <w:name w:val="Default Paragraph Font"/>
     <w:uiPriority w:val="1"/>
+    <w:semiHidden/>
     <w:unhideWhenUsed/>
   </w:style>
   <w:style w:type="table" w:default="1" w:styleId="TableNormal">
@@ -5120,7 +5282,6 @@
     <w:uiPriority w:val="99"/>
     <w:semiHidden/>
     <w:unhideWhenUsed/>
-    <w:qFormat/>
     <w:tblPr>
       <w:tblInd w:w="0" w:type="dxa"/>
       <w:tblCellMar>

</xml_diff>

<commit_message>
refactored the masterformmula. seperated the js in the other file
</commit_message>
<xml_diff>
--- a/core/main/templates/print_excel/dc_formula_template.docx
+++ b/core/main/templates/print_excel/dc_formula_template.docx
@@ -1,6 +1,6 @@
 
 <file path=word/document.xml><?xml version="1.0" encoding="utf-8"?>
-<w:document xmlns:wpc="http://schemas.microsoft.com/office/word/2010/wordprocessingCanvas" xmlns:cx="http://schemas.microsoft.com/office/drawing/2014/chartex" xmlns:cx1="http://schemas.microsoft.com/office/drawing/2015/9/8/chartex" xmlns:cx2="http://schemas.microsoft.com/office/drawing/2015/10/21/chartex" xmlns:cx3="http://schemas.microsoft.com/office/drawing/2016/5/9/chartex" xmlns:cx4="http://schemas.microsoft.com/office/drawing/2016/5/10/chartex" xmlns:cx5="http://schemas.microsoft.com/office/drawing/2016/5/11/chartex" xmlns:cx6="http://schemas.microsoft.com/office/drawing/2016/5/12/chartex" xmlns:cx7="http://schemas.microsoft.com/office/drawing/2016/5/13/chartex" xmlns:cx8="http://schemas.microsoft.com/office/drawing/2016/5/14/chartex" xmlns:mc="http://schemas.openxmlformats.org/markup-compatibility/2006" xmlns:aink="http://schemas.microsoft.com/office/drawing/2016/ink" xmlns:am3d="http://schemas.microsoft.com/office/drawing/2017/model3d" xmlns:o="urn:schemas-microsoft-com:office:office" xmlns:oel="http://schemas.microsoft.com/office/2019/extlst" xmlns:r="http://schemas.openxmlformats.org/officeDocument/2006/relationships" xmlns:m="http://schemas.openxmlformats.org/officeDocument/2006/math" xmlns:v="urn:schemas-microsoft-com:vml" xmlns:wp14="http://schemas.microsoft.com/office/word/2010/wordprocessingDrawing" xmlns:wp="http://schemas.openxmlformats.org/drawingml/2006/wordprocessingDrawing" xmlns:w10="urn:schemas-microsoft-com:office:word" xmlns:w="http://schemas.openxmlformats.org/wordprocessingml/2006/main" xmlns:w14="http://schemas.microsoft.com/office/word/2010/wordml" xmlns:w15="http://schemas.microsoft.com/office/word/2012/wordml" xmlns:w16cei="http://schemas.microsoft.com/office/word/2026/wordml/cei" xmlns:w16cex="http://schemas.microsoft.com/office/word/2018/wordml/cex" xmlns:w16cid="http://schemas.microsoft.com/office/word/2016/wordml/cid" xmlns:w16="http://schemas.microsoft.com/office/word/2018/wordml" xmlns:w16du="http://schemas.microsoft.com/office/word/2023/wordml/word16du" xmlns:w16sdtdh="http://schemas.microsoft.com/office/word/2020/wordml/sdtdatahash" xmlns:w16sdtfl="http://schemas.microsoft.com/office/word/2024/wordml/sdtformatlock" xmlns:w16se="http://schemas.microsoft.com/office/word/2015/wordml/symex" xmlns:wpg="http://schemas.microsoft.com/office/word/2010/wordprocessingGroup" xmlns:wpi="http://schemas.microsoft.com/office/word/2010/wordprocessingInk" xmlns:wne="http://schemas.microsoft.com/office/word/2006/wordml" xmlns:wps="http://schemas.microsoft.com/office/word/2010/wordprocessingShape" mc:Ignorable="w14 w15 w16se w16cid w16 w16cex w16sdtdh w16sdtfl w16du wp14">
+<w:document xmlns:wpc="http://schemas.microsoft.com/office/word/2010/wordprocessingCanvas" xmlns:cx="http://schemas.microsoft.com/office/drawing/2014/chartex" xmlns:cx1="http://schemas.microsoft.com/office/drawing/2015/9/8/chartex" xmlns:cx2="http://schemas.microsoft.com/office/drawing/2015/10/21/chartex" xmlns:cx3="http://schemas.microsoft.com/office/drawing/2016/5/9/chartex" xmlns:cx4="http://schemas.microsoft.com/office/drawing/2016/5/10/chartex" xmlns:cx5="http://schemas.microsoft.com/office/drawing/2016/5/11/chartex" xmlns:cx6="http://schemas.microsoft.com/office/drawing/2016/5/12/chartex" xmlns:cx7="http://schemas.microsoft.com/office/drawing/2016/5/13/chartex" xmlns:cx8="http://schemas.microsoft.com/office/drawing/2016/5/14/chartex" xmlns:mc="http://schemas.openxmlformats.org/markup-compatibility/2006" xmlns:aink="http://schemas.microsoft.com/office/drawing/2016/ink" xmlns:am3d="http://schemas.microsoft.com/office/drawing/2017/model3d" xmlns:o="urn:schemas-microsoft-com:office:office" xmlns:oel="http://schemas.microsoft.com/office/2019/extlst" xmlns:r="http://schemas.openxmlformats.org/officeDocument/2006/relationships" xmlns:m="http://schemas.openxmlformats.org/officeDocument/2006/math" xmlns:v="urn:schemas-microsoft-com:vml" xmlns:wp14="http://schemas.microsoft.com/office/word/2010/wordprocessingDrawing" xmlns:wp="http://schemas.openxmlformats.org/drawingml/2006/wordprocessingDrawing" xmlns:w10="urn:schemas-microsoft-com:office:word" xmlns:w="http://schemas.openxmlformats.org/wordprocessingml/2006/main" xmlns:w14="http://schemas.microsoft.com/office/word/2010/wordml" xmlns:w15="http://schemas.microsoft.com/office/word/2012/wordml" xmlns:w16cex="http://schemas.microsoft.com/office/word/2018/wordml/cex" xmlns:w16cid="http://schemas.microsoft.com/office/word/2016/wordml/cid" xmlns:w16="http://schemas.microsoft.com/office/word/2018/wordml" xmlns:w16du="http://schemas.microsoft.com/office/word/2023/wordml/word16du" xmlns:w16sdtdh="http://schemas.microsoft.com/office/word/2020/wordml/sdtdatahash" xmlns:w16sdtfl="http://schemas.microsoft.com/office/word/2024/wordml/sdtformatlock" xmlns:w16se="http://schemas.microsoft.com/office/word/2015/wordml/symex" xmlns:wpg="http://schemas.microsoft.com/office/word/2010/wordprocessingGroup" xmlns:wpi="http://schemas.microsoft.com/office/word/2010/wordprocessingInk" xmlns:wne="http://schemas.microsoft.com/office/word/2006/wordml" xmlns:wps="http://schemas.microsoft.com/office/word/2010/wordprocessingShape" mc:Ignorable="w14 w15 w16se w16cid w16 w16cex w16sdtdh w16sdtfl w16du wp14">
   <w:body>
     <w:p>
       <w:pPr>
@@ -4693,8 +4693,6 @@
           <w:rFonts w:ascii="Times New Roman" w:hAnsi="Times New Roman"/>
           <w:b/>
           <w:bCs/>
-          <w:sz w:val="24"/>
-          <w:szCs w:val="24"/>
         </w:rPr>
       </w:pPr>
       <w:r>
@@ -4724,17 +4722,15 @@
           <w:b/>
           <w:bCs/>
         </w:rPr>
-        <w:t>by:</w:t>
+        <w:t>by</w:t>
       </w:r>
       <w:r>
         <w:rPr>
           <w:rFonts w:ascii="Times New Roman" w:hAnsi="Times New Roman"/>
           <w:b/>
           <w:bCs/>
-          <w:sz w:val="24"/>
-          <w:szCs w:val="24"/>
         </w:rPr>
-        <w:t xml:space="preserve"> </w:t>
+        <w:t xml:space="preserve">: </w:t>
       </w:r>
       <w:bookmarkStart w:id="13" w:name="weighed_by"/>
       <w:bookmarkEnd w:id="13"/>
@@ -4776,7 +4772,16 @@
           <w:b/>
           <w:bCs/>
         </w:rPr>
-        <w:t>Encoded by</w:t>
+        <w:t xml:space="preserve">Encoded </w:t>
+      </w:r>
+      <w:proofErr w:type="gramStart"/>
+      <w:r>
+        <w:rPr>
+          <w:rFonts w:ascii="Times New Roman" w:hAnsi="Times New Roman"/>
+          <w:b/>
+          <w:bCs/>
+        </w:rPr>
+        <w:t>by</w:t>
       </w:r>
       <w:r>
         <w:rPr>
@@ -4794,6 +4799,7 @@
         </w:rPr>
         <w:t>:</w:t>
       </w:r>
+      <w:proofErr w:type="gramEnd"/>
       <w:r>
         <w:rPr>
           <w:rFonts w:ascii="Times New Roman" w:hAnsi="Times New Roman"/>
@@ -4820,7 +4826,7 @@
 </file>
 
 <file path=word/endnotes.xml><?xml version="1.0" encoding="utf-8"?>
-<w:endnotes xmlns:wpc="http://schemas.microsoft.com/office/word/2010/wordprocessingCanvas" xmlns:cx="http://schemas.microsoft.com/office/drawing/2014/chartex" xmlns:cx1="http://schemas.microsoft.com/office/drawing/2015/9/8/chartex" xmlns:cx2="http://schemas.microsoft.com/office/drawing/2015/10/21/chartex" xmlns:cx3="http://schemas.microsoft.com/office/drawing/2016/5/9/chartex" xmlns:cx4="http://schemas.microsoft.com/office/drawing/2016/5/10/chartex" xmlns:cx5="http://schemas.microsoft.com/office/drawing/2016/5/11/chartex" xmlns:cx6="http://schemas.microsoft.com/office/drawing/2016/5/12/chartex" xmlns:cx7="http://schemas.microsoft.com/office/drawing/2016/5/13/chartex" xmlns:cx8="http://schemas.microsoft.com/office/drawing/2016/5/14/chartex" xmlns:mc="http://schemas.openxmlformats.org/markup-compatibility/2006" xmlns:aink="http://schemas.microsoft.com/office/drawing/2016/ink" xmlns:am3d="http://schemas.microsoft.com/office/drawing/2017/model3d" xmlns:o="urn:schemas-microsoft-com:office:office" xmlns:oel="http://schemas.microsoft.com/office/2019/extlst" xmlns:r="http://schemas.openxmlformats.org/officeDocument/2006/relationships" xmlns:m="http://schemas.openxmlformats.org/officeDocument/2006/math" xmlns:v="urn:schemas-microsoft-com:vml" xmlns:wp14="http://schemas.microsoft.com/office/word/2010/wordprocessingDrawing" xmlns:wp="http://schemas.openxmlformats.org/drawingml/2006/wordprocessingDrawing" xmlns:w10="urn:schemas-microsoft-com:office:word" xmlns:w="http://schemas.openxmlformats.org/wordprocessingml/2006/main" xmlns:w14="http://schemas.microsoft.com/office/word/2010/wordml" xmlns:w15="http://schemas.microsoft.com/office/word/2012/wordml" xmlns:w16cei="http://schemas.microsoft.com/office/word/2026/wordml/cei" xmlns:w16cex="http://schemas.microsoft.com/office/word/2018/wordml/cex" xmlns:w16cid="http://schemas.microsoft.com/office/word/2016/wordml/cid" xmlns:w16="http://schemas.microsoft.com/office/word/2018/wordml" xmlns:w16du="http://schemas.microsoft.com/office/word/2023/wordml/word16du" xmlns:w16sdtdh="http://schemas.microsoft.com/office/word/2020/wordml/sdtdatahash" xmlns:w16sdtfl="http://schemas.microsoft.com/office/word/2024/wordml/sdtformatlock" xmlns:w16se="http://schemas.microsoft.com/office/word/2015/wordml/symex" xmlns:wpg="http://schemas.microsoft.com/office/word/2010/wordprocessingGroup" xmlns:wpi="http://schemas.microsoft.com/office/word/2010/wordprocessingInk" xmlns:wne="http://schemas.microsoft.com/office/word/2006/wordml" xmlns:wps="http://schemas.microsoft.com/office/word/2010/wordprocessingShape" mc:Ignorable="w14 w15 w16se w16cid w16 w16cex w16sdtdh w16sdtfl w16du wp14">
+<w:endnotes xmlns:wpc="http://schemas.microsoft.com/office/word/2010/wordprocessingCanvas" xmlns:cx="http://schemas.microsoft.com/office/drawing/2014/chartex" xmlns:cx1="http://schemas.microsoft.com/office/drawing/2015/9/8/chartex" xmlns:cx2="http://schemas.microsoft.com/office/drawing/2015/10/21/chartex" xmlns:cx3="http://schemas.microsoft.com/office/drawing/2016/5/9/chartex" xmlns:cx4="http://schemas.microsoft.com/office/drawing/2016/5/10/chartex" xmlns:cx5="http://schemas.microsoft.com/office/drawing/2016/5/11/chartex" xmlns:cx6="http://schemas.microsoft.com/office/drawing/2016/5/12/chartex" xmlns:cx7="http://schemas.microsoft.com/office/drawing/2016/5/13/chartex" xmlns:cx8="http://schemas.microsoft.com/office/drawing/2016/5/14/chartex" xmlns:mc="http://schemas.openxmlformats.org/markup-compatibility/2006" xmlns:aink="http://schemas.microsoft.com/office/drawing/2016/ink" xmlns:am3d="http://schemas.microsoft.com/office/drawing/2017/model3d" xmlns:o="urn:schemas-microsoft-com:office:office" xmlns:oel="http://schemas.microsoft.com/office/2019/extlst" xmlns:r="http://schemas.openxmlformats.org/officeDocument/2006/relationships" xmlns:m="http://schemas.openxmlformats.org/officeDocument/2006/math" xmlns:v="urn:schemas-microsoft-com:vml" xmlns:wp14="http://schemas.microsoft.com/office/word/2010/wordprocessingDrawing" xmlns:wp="http://schemas.openxmlformats.org/drawingml/2006/wordprocessingDrawing" xmlns:w10="urn:schemas-microsoft-com:office:word" xmlns:w="http://schemas.openxmlformats.org/wordprocessingml/2006/main" xmlns:w14="http://schemas.microsoft.com/office/word/2010/wordml" xmlns:w15="http://schemas.microsoft.com/office/word/2012/wordml" xmlns:w16cex="http://schemas.microsoft.com/office/word/2018/wordml/cex" xmlns:w16cid="http://schemas.microsoft.com/office/word/2016/wordml/cid" xmlns:w16="http://schemas.microsoft.com/office/word/2018/wordml" xmlns:w16du="http://schemas.microsoft.com/office/word/2023/wordml/word16du" xmlns:w16sdtdh="http://schemas.microsoft.com/office/word/2020/wordml/sdtdatahash" xmlns:w16sdtfl="http://schemas.microsoft.com/office/word/2024/wordml/sdtformatlock" xmlns:w16se="http://schemas.microsoft.com/office/word/2015/wordml/symex" xmlns:wpg="http://schemas.microsoft.com/office/word/2010/wordprocessingGroup" xmlns:wpi="http://schemas.microsoft.com/office/word/2010/wordprocessingInk" xmlns:wne="http://schemas.microsoft.com/office/word/2006/wordml" xmlns:wps="http://schemas.microsoft.com/office/word/2010/wordprocessingShape" mc:Ignorable="w14 w15 w16se w16cid w16 w16cex w16sdtdh w16sdtfl w16du wp14">
   <w:endnote w:type="separator" w:id="-1">
     <w:p>
       <w:pPr>
@@ -4845,7 +4851,7 @@
 </file>
 
 <file path=word/footnotes.xml><?xml version="1.0" encoding="utf-8"?>
-<w:footnotes xmlns:wpc="http://schemas.microsoft.com/office/word/2010/wordprocessingCanvas" xmlns:cx="http://schemas.microsoft.com/office/drawing/2014/chartex" xmlns:cx1="http://schemas.microsoft.com/office/drawing/2015/9/8/chartex" xmlns:cx2="http://schemas.microsoft.com/office/drawing/2015/10/21/chartex" xmlns:cx3="http://schemas.microsoft.com/office/drawing/2016/5/9/chartex" xmlns:cx4="http://schemas.microsoft.com/office/drawing/2016/5/10/chartex" xmlns:cx5="http://schemas.microsoft.com/office/drawing/2016/5/11/chartex" xmlns:cx6="http://schemas.microsoft.com/office/drawing/2016/5/12/chartex" xmlns:cx7="http://schemas.microsoft.com/office/drawing/2016/5/13/chartex" xmlns:cx8="http://schemas.microsoft.com/office/drawing/2016/5/14/chartex" xmlns:mc="http://schemas.openxmlformats.org/markup-compatibility/2006" xmlns:aink="http://schemas.microsoft.com/office/drawing/2016/ink" xmlns:am3d="http://schemas.microsoft.com/office/drawing/2017/model3d" xmlns:o="urn:schemas-microsoft-com:office:office" xmlns:oel="http://schemas.microsoft.com/office/2019/extlst" xmlns:r="http://schemas.openxmlformats.org/officeDocument/2006/relationships" xmlns:m="http://schemas.openxmlformats.org/officeDocument/2006/math" xmlns:v="urn:schemas-microsoft-com:vml" xmlns:wp14="http://schemas.microsoft.com/office/word/2010/wordprocessingDrawing" xmlns:wp="http://schemas.openxmlformats.org/drawingml/2006/wordprocessingDrawing" xmlns:w10="urn:schemas-microsoft-com:office:word" xmlns:w="http://schemas.openxmlformats.org/wordprocessingml/2006/main" xmlns:w14="http://schemas.microsoft.com/office/word/2010/wordml" xmlns:w15="http://schemas.microsoft.com/office/word/2012/wordml" xmlns:w16cei="http://schemas.microsoft.com/office/word/2026/wordml/cei" xmlns:w16cex="http://schemas.microsoft.com/office/word/2018/wordml/cex" xmlns:w16cid="http://schemas.microsoft.com/office/word/2016/wordml/cid" xmlns:w16="http://schemas.microsoft.com/office/word/2018/wordml" xmlns:w16du="http://schemas.microsoft.com/office/word/2023/wordml/word16du" xmlns:w16sdtdh="http://schemas.microsoft.com/office/word/2020/wordml/sdtdatahash" xmlns:w16sdtfl="http://schemas.microsoft.com/office/word/2024/wordml/sdtformatlock" xmlns:w16se="http://schemas.microsoft.com/office/word/2015/wordml/symex" xmlns:wpg="http://schemas.microsoft.com/office/word/2010/wordprocessingGroup" xmlns:wpi="http://schemas.microsoft.com/office/word/2010/wordprocessingInk" xmlns:wne="http://schemas.microsoft.com/office/word/2006/wordml" xmlns:wps="http://schemas.microsoft.com/office/word/2010/wordprocessingShape" mc:Ignorable="w14 w15 w16se w16cid w16 w16cex w16sdtdh w16sdtfl w16du wp14">
+<w:footnotes xmlns:wpc="http://schemas.microsoft.com/office/word/2010/wordprocessingCanvas" xmlns:cx="http://schemas.microsoft.com/office/drawing/2014/chartex" xmlns:cx1="http://schemas.microsoft.com/office/drawing/2015/9/8/chartex" xmlns:cx2="http://schemas.microsoft.com/office/drawing/2015/10/21/chartex" xmlns:cx3="http://schemas.microsoft.com/office/drawing/2016/5/9/chartex" xmlns:cx4="http://schemas.microsoft.com/office/drawing/2016/5/10/chartex" xmlns:cx5="http://schemas.microsoft.com/office/drawing/2016/5/11/chartex" xmlns:cx6="http://schemas.microsoft.com/office/drawing/2016/5/12/chartex" xmlns:cx7="http://schemas.microsoft.com/office/drawing/2016/5/13/chartex" xmlns:cx8="http://schemas.microsoft.com/office/drawing/2016/5/14/chartex" xmlns:mc="http://schemas.openxmlformats.org/markup-compatibility/2006" xmlns:aink="http://schemas.microsoft.com/office/drawing/2016/ink" xmlns:am3d="http://schemas.microsoft.com/office/drawing/2017/model3d" xmlns:o="urn:schemas-microsoft-com:office:office" xmlns:oel="http://schemas.microsoft.com/office/2019/extlst" xmlns:r="http://schemas.openxmlformats.org/officeDocument/2006/relationships" xmlns:m="http://schemas.openxmlformats.org/officeDocument/2006/math" xmlns:v="urn:schemas-microsoft-com:vml" xmlns:wp14="http://schemas.microsoft.com/office/word/2010/wordprocessingDrawing" xmlns:wp="http://schemas.openxmlformats.org/drawingml/2006/wordprocessingDrawing" xmlns:w10="urn:schemas-microsoft-com:office:word" xmlns:w="http://schemas.openxmlformats.org/wordprocessingml/2006/main" xmlns:w14="http://schemas.microsoft.com/office/word/2010/wordml" xmlns:w15="http://schemas.microsoft.com/office/word/2012/wordml" xmlns:w16cex="http://schemas.microsoft.com/office/word/2018/wordml/cex" xmlns:w16cid="http://schemas.microsoft.com/office/word/2016/wordml/cid" xmlns:w16="http://schemas.microsoft.com/office/word/2018/wordml" xmlns:w16du="http://schemas.microsoft.com/office/word/2023/wordml/word16du" xmlns:w16sdtdh="http://schemas.microsoft.com/office/word/2020/wordml/sdtdatahash" xmlns:w16sdtfl="http://schemas.microsoft.com/office/word/2024/wordml/sdtformatlock" xmlns:w16se="http://schemas.microsoft.com/office/word/2015/wordml/symex" xmlns:wpg="http://schemas.microsoft.com/office/word/2010/wordprocessingGroup" xmlns:wpi="http://schemas.microsoft.com/office/word/2010/wordprocessingInk" xmlns:wne="http://schemas.microsoft.com/office/word/2006/wordml" xmlns:wps="http://schemas.microsoft.com/office/word/2010/wordprocessingShape" mc:Ignorable="w14 w15 w16se w16cid w16 w16cex w16sdtdh w16sdtfl w16du wp14">
   <w:footnote w:type="separator" w:id="-1">
     <w:p>
       <w:pPr>
@@ -4875,7 +4881,7 @@
     <w:rPrDefault>
       <w:rPr>
         <w:rFonts w:ascii="Calibri" w:eastAsia="Calibri" w:hAnsi="Calibri" w:cs="Times New Roman"/>
-        <w:lang w:val="en-PH" w:eastAsia="en-PH" w:bidi="ar-SA"/>
+        <w:lang w:val="en-US" w:eastAsia="en-US" w:bidi="ar-SA"/>
       </w:rPr>
     </w:rPrDefault>
     <w:pPrDefault/>
@@ -5268,7 +5274,6 @@
     <w:rPr>
       <w:sz w:val="22"/>
       <w:szCs w:val="22"/>
-      <w:lang w:val="en-US" w:eastAsia="en-US"/>
     </w:rPr>
   </w:style>
   <w:style w:type="character" w:default="1" w:styleId="DefaultParagraphFont">

</xml_diff>